<commit_message>
esame 8luglio a meta
</commit_message>
<xml_diff>
--- a/Appunti lezione/Esercizi con BST.docx
+++ b/Appunti lezione/Esercizi con BST.docx
@@ -2154,6 +2154,7 @@
       </w:pPr>
       <w:r>
         <w:rPr>
+          <w:noProof/>
           <w:lang w:val="it-IT"/>
         </w:rPr>
         <w:drawing>
@@ -2222,6 +2223,7 @@
       </w:r>
       <w:r>
         <w:rPr>
+          <w:noProof/>
           <w:lang w:val="it-IT"/>
         </w:rPr>
         <w:drawing>
@@ -2311,6 +2313,7 @@
       </w:pPr>
       <w:r>
         <w:rPr>
+          <w:noProof/>
           <w:lang w:val="it-IT"/>
         </w:rPr>
         <w:drawing>
@@ -3277,11 +3280,13 @@
     <w:p>
       <w:pPr>
         <w:rPr>
-          <w:lang w:val="it-IT"/>
-        </w:rPr>
-      </w:pPr>
-      <w:r>
-        <w:rPr>
+          <w:color w:val="EE0000"/>
+          <w:lang w:val="it-IT"/>
+        </w:rPr>
+      </w:pPr>
+      <w:r>
+        <w:rPr>
+          <w:color w:val="EE0000"/>
           <w:lang w:val="it-IT"/>
         </w:rPr>
         <w:t>Questo è il metodo per copiare un albero in una lista in maniera ordinata</w:t>
@@ -4879,6 +4884,7 @@
   <w:style w:type="character" w:default="1" w:styleId="DefaultParagraphFont">
     <w:name w:val="Default Paragraph Font"/>
     <w:uiPriority w:val="1"/>
+    <w:semiHidden/>
     <w:unhideWhenUsed/>
   </w:style>
   <w:style w:type="table" w:default="1" w:styleId="TableNormal">

</xml_diff>